<commit_message>
modified:   coaching_profile.py 	modified:   instructionsv17.md 	modified:   semantic_json_builder.py
</commit_message>
<xml_diff>
--- a/docs/Lactate_Intergration_Personalised_Z2.docx
+++ b/docs/Lactate_Intergration_Personalised_Z2.docx
@@ -10,6 +10,9 @@
         </w:rPr>
       </w:pPr>
       <w:r>
+        <w:rPr>
+          <w:noProof/>
+        </w:rPr>
         <w:drawing>
           <wp:anchor distT="0" distB="0" distL="114300" distR="114300" simplePos="0" relativeHeight="251658240" behindDoc="1" locked="0" layoutInCell="1" allowOverlap="1" wp14:anchorId="22F788EF" wp14:editId="483DCADC">
             <wp:simplePos x="0" y="0"/>
@@ -189,7 +192,7 @@
     <w:p>
       <w:r>
         <w:pict w14:anchorId="380F66FF">
-          <v:rect id="_x0000_i1116" style="width:0;height:1.5pt" o:hralign="center" o:hrstd="t" o:hr="t" fillcolor="#a0a0a0" stroked="f"/>
+          <v:rect id="_x0000_i1025" style="width:0;height:1.5pt" o:hralign="center" o:hrstd="t" o:hr="t" fillcolor="#a0a0a0" stroked="f"/>
         </w:pict>
       </w:r>
     </w:p>
@@ -357,7 +360,6 @@
       <w:r>
         <w:t xml:space="preserve">Unpaired lactate samples (mmol only) are valid for </w:t>
       </w:r>
-      <w:proofErr w:type="gramStart"/>
       <w:r>
         <w:rPr>
           <w:b/>
@@ -366,11 +368,7 @@
         <w:t>summary</w:t>
       </w:r>
       <w:r>
-        <w:t>, but</w:t>
-      </w:r>
-      <w:proofErr w:type="gramEnd"/>
-      <w:r>
-        <w:t xml:space="preserve"> </w:t>
+        <w:t xml:space="preserve">, but </w:t>
       </w:r>
       <w:r>
         <w:rPr>
@@ -386,7 +384,7 @@
     <w:p>
       <w:r>
         <w:pict w14:anchorId="41EF0BBE">
-          <v:rect id="_x0000_i1117" style="width:0;height:1.5pt" o:hralign="center" o:hrstd="t" o:hr="t" fillcolor="#a0a0a0" stroked="f"/>
+          <v:rect id="_x0000_i1026" style="width:0;height:1.5pt" o:hralign="center" o:hrstd="t" o:hr="t" fillcolor="#a0a0a0" stroked="f"/>
         </w:pict>
       </w:r>
     </w:p>
@@ -475,7 +473,7 @@
     <w:p>
       <w:r>
         <w:pict w14:anchorId="0AA26054">
-          <v:rect id="_x0000_i1118" style="width:0;height:1.5pt" o:hralign="center" o:hrstd="t" o:hr="t" fillcolor="#a0a0a0" stroked="f"/>
+          <v:rect id="_x0000_i1027" style="width:0;height:1.5pt" o:hralign="center" o:hrstd="t" o:hr="t" fillcolor="#a0a0a0" stroked="f"/>
         </w:pict>
       </w:r>
     </w:p>
@@ -627,7 +625,7 @@
     <w:p>
       <w:r>
         <w:pict w14:anchorId="12562400">
-          <v:rect id="_x0000_i1119" style="width:0;height:1.5pt" o:hralign="center" o:hrstd="t" o:hr="t" fillcolor="#a0a0a0" stroked="f"/>
+          <v:rect id="_x0000_i1028" style="width:0;height:1.5pt" o:hralign="center" o:hrstd="t" o:hr="t" fillcolor="#a0a0a0" stroked="f"/>
         </w:pict>
       </w:r>
     </w:p>
@@ -875,7 +873,7 @@
     <w:p>
       <w:r>
         <w:pict w14:anchorId="0DAFD14B">
-          <v:rect id="_x0000_i1120" style="width:0;height:1.5pt" o:hralign="center" o:hrstd="t" o:hr="t" fillcolor="#a0a0a0" stroked="f"/>
+          <v:rect id="_x0000_i1029" style="width:0;height:1.5pt" o:hralign="center" o:hrstd="t" o:hr="t" fillcolor="#a0a0a0" stroked="f"/>
         </w:pict>
       </w:r>
     </w:p>
@@ -884,15 +882,7 @@
         <w:pStyle w:val="Heading2"/>
       </w:pPr>
       <w:r>
-        <w:t xml:space="preserve">5. </w:t>
-      </w:r>
-      <w:proofErr w:type="gramStart"/>
-      <w:r>
-        <w:t>How</w:t>
-      </w:r>
-      <w:proofErr w:type="gramEnd"/>
-      <w:r>
-        <w:t xml:space="preserve"> Personalised Zone 2 Is Derived</w:t>
+        <w:t>5. How Personalised Zone 2 Is Derived</w:t>
       </w:r>
     </w:p>
     <w:p>
@@ -1059,13 +1049,8 @@
         </w:numPr>
       </w:pPr>
       <w:r>
-        <w:t xml:space="preserve">Method: </w:t>
-      </w:r>
-      <w:proofErr w:type="spellStart"/>
-      <w:r>
-        <w:t>lactate_inferred</w:t>
-      </w:r>
-      <w:proofErr w:type="spellEnd"/>
+        <w:t>Method: lactate_inferred</w:t>
+      </w:r>
     </w:p>
     <w:p>
       <w:pPr>
@@ -1096,7 +1081,7 @@
     <w:p>
       <w:r>
         <w:pict w14:anchorId="2CFCF40D">
-          <v:rect id="_x0000_i1121" style="width:0;height:1.5pt" o:hralign="center" o:hrstd="t" o:hr="t" fillcolor="#a0a0a0" stroked="f"/>
+          <v:rect id="_x0000_i1030" style="width:0;height:1.5pt" o:hralign="center" o:hrstd="t" o:hr="t" fillcolor="#a0a0a0" stroked="f"/>
         </w:pict>
       </w:r>
     </w:p>
@@ -1208,7 +1193,7 @@
     <w:p>
       <w:r>
         <w:pict w14:anchorId="7F2B6D56">
-          <v:rect id="_x0000_i1122" style="width:0;height:1.5pt" o:hralign="center" o:hrstd="t" o:hr="t" fillcolor="#a0a0a0" stroked="f"/>
+          <v:rect id="_x0000_i1031" style="width:0;height:1.5pt" o:hralign="center" o:hrstd="t" o:hr="t" fillcolor="#a0a0a0" stroked="f"/>
         </w:pict>
       </w:r>
     </w:p>
@@ -1310,7 +1295,7 @@
     <w:p>
       <w:r>
         <w:pict w14:anchorId="400E7B8C">
-          <v:rect id="_x0000_i1123" style="width:0;height:1.5pt" o:hralign="center" o:hrstd="t" o:hr="t" fillcolor="#a0a0a0" stroked="f"/>
+          <v:rect id="_x0000_i1032" style="width:0;height:1.5pt" o:hralign="center" o:hrstd="t" o:hr="t" fillcolor="#a0a0a0" stroked="f"/>
         </w:pict>
       </w:r>
     </w:p>
@@ -1379,7 +1364,7 @@
     <w:p>
       <w:r>
         <w:pict w14:anchorId="06A674B7">
-          <v:rect id="_x0000_i1124" style="width:0;height:1.5pt" o:hralign="center" o:hrstd="t" o:hr="t" fillcolor="#a0a0a0" stroked="f"/>
+          <v:rect id="_x0000_i1033" style="width:0;height:1.5pt" o:hralign="center" o:hrstd="t" o:hr="t" fillcolor="#a0a0a0" stroked="f"/>
         </w:pict>
       </w:r>
     </w:p>
@@ -1539,7 +1524,7 @@
     <w:p>
       <w:r>
         <w:pict w14:anchorId="3AD85591">
-          <v:rect id="_x0000_i1125" style="width:0;height:1.5pt" o:hralign="center" o:hrstd="t" o:hr="t" fillcolor="#a0a0a0" stroked="f"/>
+          <v:rect id="_x0000_i1034" style="width:0;height:1.5pt" o:hralign="center" o:hrstd="t" o:hr="t" fillcolor="#a0a0a0" stroked="f"/>
         </w:pict>
       </w:r>
     </w:p>
@@ -1599,7 +1584,7 @@
     <w:p>
       <w:r>
         <w:pict w14:anchorId="18576149">
-          <v:rect id="_x0000_i1126" style="width:0;height:1.5pt" o:hralign="center" o:hrstd="t" o:hr="t" fillcolor="#a0a0a0" stroked="f"/>
+          <v:rect id="_x0000_i1035" style="width:0;height:1.5pt" o:hralign="center" o:hrstd="t" o:hr="t" fillcolor="#a0a0a0" stroked="f"/>
         </w:pict>
       </w:r>
     </w:p>
@@ -1673,7 +1658,7 @@
     <w:p>
       <w:r>
         <w:pict w14:anchorId="6B3BFD8A">
-          <v:rect id="_x0000_i1127" style="width:0;height:1.5pt" o:hralign="center" o:hrstd="t" o:hr="t" fillcolor="#a0a0a0" stroked="f"/>
+          <v:rect id="_x0000_i1036" style="width:0;height:1.5pt" o:hralign="center" o:hrstd="t" o:hr="t" fillcolor="#a0a0a0" stroked="f"/>
         </w:pict>
       </w:r>
     </w:p>
@@ -1709,13 +1694,8 @@
         </w:numPr>
       </w:pPr>
       <w:r>
-        <w:t xml:space="preserve">Reversible </w:t>
-      </w:r>
-      <w:proofErr w:type="gramStart"/>
-      <w:r>
-        <w:t>at all times</w:t>
-      </w:r>
-      <w:proofErr w:type="gramEnd"/>
+        <w:t>Reversible at all times</w:t>
+      </w:r>
     </w:p>
     <w:p>
       <w:pPr>
@@ -1781,7 +1761,7 @@
     <w:p>
       <w:r>
         <w:pict w14:anchorId="777A9708">
-          <v:rect id="_x0000_i1128" style="width:0;height:1.5pt" o:hralign="center" o:hrstd="t" o:hr="t" fillcolor="#a0a0a0" stroked="f"/>
+          <v:rect id="_x0000_i1037" style="width:0;height:1.5pt" o:hralign="center" o:hrstd="t" o:hr="t" fillcolor="#a0a0a0" stroked="f"/>
         </w:pict>
       </w:r>
     </w:p>
@@ -1884,7 +1864,7 @@
     <w:p>
       <w:r>
         <w:pict w14:anchorId="35011082">
-          <v:rect id="_x0000_i1129" style="width:0;height:1.5pt" o:hralign="center" o:hrstd="t" o:hr="t" fillcolor="#a0a0a0" stroked="f"/>
+          <v:rect id="_x0000_i1038" style="width:0;height:1.5pt" o:hralign="center" o:hrstd="t" o:hr="t" fillcolor="#a0a0a0" stroked="f"/>
         </w:pict>
       </w:r>
     </w:p>
@@ -1920,7 +1900,7 @@
     <w:p>
       <w:r>
         <w:pict w14:anchorId="1C2C4E43">
-          <v:rect id="_x0000_i1192" style="width:0;height:1.5pt" o:hralign="center" o:hrstd="t" o:hr="t" fillcolor="#a0a0a0" stroked="f"/>
+          <v:rect id="_x0000_i1039" style="width:0;height:1.5pt" o:hralign="center" o:hrstd="t" o:hr="t" fillcolor="#a0a0a0" stroked="f"/>
         </w:pict>
       </w:r>
     </w:p>
@@ -2135,7 +2115,7 @@
     <w:p>
       <w:r>
         <w:pict w14:anchorId="16680593">
-          <v:rect id="_x0000_i1180" style="width:0;height:1.5pt" o:hralign="center" o:hrstd="t" o:hr="t" fillcolor="#a0a0a0" stroked="f"/>
+          <v:rect id="_x0000_i1040" style="width:0;height:1.5pt" o:hralign="center" o:hrstd="t" o:hr="t" fillcolor="#a0a0a0" stroked="f"/>
         </w:pict>
       </w:r>
     </w:p>
@@ -2424,7 +2404,7 @@
     <w:p>
       <w:r>
         <w:pict w14:anchorId="2FAA9C37">
-          <v:rect id="_x0000_i1181" style="width:0;height:1.5pt" o:hralign="center" o:hrstd="t" o:hr="t" fillcolor="#a0a0a0" stroked="f"/>
+          <v:rect id="_x0000_i1041" style="width:0;height:1.5pt" o:hralign="center" o:hrstd="t" o:hr="t" fillcolor="#a0a0a0" stroked="f"/>
         </w:pict>
       </w:r>
     </w:p>
@@ -2579,7 +2559,7 @@
     <w:p>
       <w:r>
         <w:pict w14:anchorId="3F37AC38">
-          <v:rect id="_x0000_i1182" style="width:0;height:1.5pt" o:hralign="center" o:hrstd="t" o:hr="t" fillcolor="#a0a0a0" stroked="f"/>
+          <v:rect id="_x0000_i1042" style="width:0;height:1.5pt" o:hralign="center" o:hrstd="t" o:hr="t" fillcolor="#a0a0a0" stroked="f"/>
         </w:pict>
       </w:r>
     </w:p>
@@ -2691,7 +2671,7 @@
     <w:p>
       <w:r>
         <w:pict w14:anchorId="55D6A9B3">
-          <v:rect id="_x0000_i1183" style="width:0;height:1.5pt" o:hralign="center" o:hrstd="t" o:hr="t" fillcolor="#a0a0a0" stroked="f"/>
+          <v:rect id="_x0000_i1043" style="width:0;height:1.5pt" o:hralign="center" o:hrstd="t" o:hr="t" fillcolor="#a0a0a0" stroked="f"/>
         </w:pict>
       </w:r>
     </w:p>
@@ -2708,17 +2688,8 @@
           <w:bCs/>
         </w:rPr>
         <w:lastRenderedPageBreak/>
-        <w:t xml:space="preserve">2. Your hard sessions are </w:t>
-      </w:r>
-      <w:proofErr w:type="gramStart"/>
-      <w:r>
-        <w:rPr>
-          <w:b/>
-          <w:bCs/>
-        </w:rPr>
-        <w:t>actually fine</w:t>
-      </w:r>
-      <w:proofErr w:type="gramEnd"/>
+        <w:t>2. Your hard sessions are actually fine</w:t>
+      </w:r>
     </w:p>
     <w:p>
       <w:r>
@@ -2743,13 +2714,8 @@
           <w:numId w:val="29"/>
         </w:numPr>
       </w:pPr>
-      <w:proofErr w:type="gramStart"/>
-      <w:r>
-        <w:t>Well</w:t>
-      </w:r>
-      <w:proofErr w:type="gramEnd"/>
-      <w:r>
-        <w:t xml:space="preserve"> executed</w:t>
+      <w:r>
+        <w:t>Well executed</w:t>
       </w:r>
     </w:p>
     <w:p>
@@ -2791,7 +2757,7 @@
     <w:p>
       <w:r>
         <w:pict w14:anchorId="27390B33">
-          <v:rect id="_x0000_i1184" style="width:0;height:1.5pt" o:hralign="center" o:hrstd="t" o:hr="t" fillcolor="#a0a0a0" stroked="f"/>
+          <v:rect id="_x0000_i1044" style="width:0;height:1.5pt" o:hralign="center" o:hrstd="t" o:hr="t" fillcolor="#a0a0a0" stroked="f"/>
         </w:pict>
       </w:r>
     </w:p>
@@ -2906,7 +2872,7 @@
     <w:p>
       <w:r>
         <w:pict w14:anchorId="526F6ED4">
-          <v:rect id="_x0000_i1185" style="width:0;height:1.5pt" o:hralign="center" o:hrstd="t" o:hr="t" fillcolor="#a0a0a0" stroked="f"/>
+          <v:rect id="_x0000_i1045" style="width:0;height:1.5pt" o:hralign="center" o:hrstd="t" o:hr="t" fillcolor="#a0a0a0" stroked="f"/>
         </w:pict>
       </w:r>
     </w:p>
@@ -3065,7 +3031,7 @@
       </w:pPr>
       <w:r>
         <w:pict w14:anchorId="13035CA4">
-          <v:rect id="_x0000_i1257" style="width:0;height:1.5pt" o:hralign="center" o:hrstd="t" o:hr="t" fillcolor="#a0a0a0" stroked="f"/>
+          <v:rect id="_x0000_i1046" style="width:0;height:1.5pt" o:hralign="center" o:hrstd="t" o:hr="t" fillcolor="#a0a0a0" stroked="f"/>
         </w:pict>
       </w:r>
     </w:p>
@@ -3141,21 +3107,13 @@
         <w:t>lactate-personalised Z2</w:t>
       </w:r>
       <w:r>
-        <w:t xml:space="preserve"> — and why </w:t>
-      </w:r>
-      <w:proofErr w:type="gramStart"/>
-      <w:r>
-        <w:t>this matters</w:t>
-      </w:r>
-      <w:proofErr w:type="gramEnd"/>
-      <w:r>
-        <w:t>.</w:t>
+        <w:t xml:space="preserve"> — and why this matters.</w:t>
       </w:r>
     </w:p>
     <w:p>
       <w:r>
         <w:pict w14:anchorId="629BAE51">
-          <v:rect id="_x0000_i1241" style="width:0;height:1.5pt" o:hralign="center" o:hrstd="t" o:hr="t" fillcolor="#a0a0a0" stroked="f"/>
+          <v:rect id="_x0000_i1047" style="width:0;height:1.5pt" o:hralign="center" o:hrstd="t" o:hr="t" fillcolor="#a0a0a0" stroked="f"/>
         </w:pict>
       </w:r>
     </w:p>
@@ -3268,7 +3226,7 @@
     <w:p>
       <w:r>
         <w:pict w14:anchorId="097B3E48">
-          <v:rect id="_x0000_i1242" style="width:0;height:1.5pt" o:hralign="center" o:hrstd="t" o:hr="t" fillcolor="#a0a0a0" stroked="f"/>
+          <v:rect id="_x0000_i1048" style="width:0;height:1.5pt" o:hralign="center" o:hrstd="t" o:hr="t" fillcolor="#a0a0a0" stroked="f"/>
         </w:pict>
       </w:r>
     </w:p>
@@ -3292,23 +3250,7 @@
           <w:b/>
           <w:bCs/>
         </w:rPr>
-        <w:t xml:space="preserve"> How your Z2 rides </w:t>
-      </w:r>
-      <w:proofErr w:type="gramStart"/>
-      <w:r>
-        <w:rPr>
-          <w:b/>
-          <w:bCs/>
-        </w:rPr>
-        <w:t>actually look</w:t>
-      </w:r>
-      <w:proofErr w:type="gramEnd"/>
-      <w:r>
-        <w:rPr>
-          <w:b/>
-          <w:bCs/>
-        </w:rPr>
-        <w:t xml:space="preserve"> (pattern-based)</w:t>
+        <w:t xml:space="preserve"> How your Z2 rides actually look (pattern-based)</w:t>
       </w:r>
     </w:p>
     <w:p>
@@ -3618,13 +3560,8 @@
       </w:tr>
     </w:tbl>
     <w:p>
-      <w:proofErr w:type="gramStart"/>
-      <w:r>
-        <w:t>So</w:t>
-      </w:r>
-      <w:proofErr w:type="gramEnd"/>
-      <w:r>
-        <w:t xml:space="preserve"> while the </w:t>
+      <w:r>
+        <w:t xml:space="preserve">So while the </w:t>
       </w:r>
       <w:r>
         <w:rPr>
@@ -3650,7 +3587,7 @@
     <w:p>
       <w:r>
         <w:pict w14:anchorId="5811165D">
-          <v:rect id="_x0000_i1243" style="width:0;height:1.5pt" o:hralign="center" o:hrstd="t" o:hr="t" fillcolor="#a0a0a0" stroked="f"/>
+          <v:rect id="_x0000_i1049" style="width:0;height:1.5pt" o:hralign="center" o:hrstd="t" o:hr="t" fillcolor="#a0a0a0" stroked="f"/>
         </w:pict>
       </w:r>
     </w:p>
@@ -3745,7 +3682,7 @@
     <w:p>
       <w:r>
         <w:pict w14:anchorId="2293CF32">
-          <v:rect id="_x0000_i1244" style="width:0;height:1.5pt" o:hralign="center" o:hrstd="t" o:hr="t" fillcolor="#a0a0a0" stroked="f"/>
+          <v:rect id="_x0000_i1050" style="width:0;height:1.5pt" o:hralign="center" o:hrstd="t" o:hr="t" fillcolor="#a0a0a0" stroked="f"/>
         </w:pict>
       </w:r>
     </w:p>
@@ -3855,7 +3792,7 @@
     <w:p>
       <w:r>
         <w:pict w14:anchorId="1B8069BD">
-          <v:rect id="_x0000_i1245" style="width:0;height:1.5pt" o:hralign="center" o:hrstd="t" o:hr="t" fillcolor="#a0a0a0" stroked="f"/>
+          <v:rect id="_x0000_i1051" style="width:0;height:1.5pt" o:hralign="center" o:hrstd="t" o:hr="t" fillcolor="#a0a0a0" stroked="f"/>
         </w:pict>
       </w:r>
     </w:p>
@@ -3884,80 +3821,22 @@
     </w:p>
     <w:p>
       <w:r>
-        <w:t>[ EASY &lt;</w:t>
-      </w:r>
-      <w:proofErr w:type="gramStart"/>
-      <w:r>
-        <w:t>210 ]</w:t>
-      </w:r>
-      <w:proofErr w:type="gramEnd"/>
-      <w:r>
-        <w:t xml:space="preserve"> ===== [ Z2 210–</w:t>
-      </w:r>
-      <w:proofErr w:type="gramStart"/>
-      <w:r>
-        <w:t>225 ]</w:t>
-      </w:r>
-      <w:proofErr w:type="gramEnd"/>
-      <w:r>
-        <w:t xml:space="preserve"> ===== [ </w:t>
-      </w:r>
-      <w:proofErr w:type="gramStart"/>
-      <w:r>
-        <w:t>HARD ]</w:t>
-      </w:r>
-      <w:proofErr w:type="gramEnd"/>
-    </w:p>
-    <w:p>
-      <w:r>
-        <w:rPr>
-          <w:b/>
-          <w:bCs/>
-        </w:rPr>
-        <w:t xml:space="preserve">What’s </w:t>
-      </w:r>
-      <w:proofErr w:type="gramStart"/>
-      <w:r>
-        <w:rPr>
-          <w:b/>
-          <w:bCs/>
-        </w:rPr>
-        <w:t>actually happening</w:t>
-      </w:r>
-      <w:proofErr w:type="gramEnd"/>
-      <w:r>
-        <w:rPr>
-          <w:b/>
-          <w:bCs/>
-        </w:rPr>
-        <w:t>:</w:t>
-      </w:r>
-    </w:p>
-    <w:p>
-      <w:r>
-        <w:t xml:space="preserve">[ </w:t>
-      </w:r>
-      <w:proofErr w:type="gramStart"/>
-      <w:r>
-        <w:t>EASY ]</w:t>
-      </w:r>
-      <w:proofErr w:type="gramEnd"/>
-      <w:r>
-        <w:t xml:space="preserve"> == [ Z</w:t>
-      </w:r>
-      <w:proofErr w:type="gramStart"/>
-      <w:r>
-        <w:t>2 ]</w:t>
-      </w:r>
-      <w:proofErr w:type="gramEnd"/>
-      <w:r>
-        <w:t xml:space="preserve"> ===================== [ </w:t>
-      </w:r>
-      <w:proofErr w:type="gramStart"/>
-      <w:r>
-        <w:t>HARD ]</w:t>
-      </w:r>
-      <w:proofErr w:type="gramEnd"/>
+        <w:t>[ EASY &lt;210 ] ===== [ Z2 210–225 ] ===== [ HARD ]</w:t>
+      </w:r>
+    </w:p>
+    <w:p>
+      <w:r>
+        <w:rPr>
+          <w:b/>
+          <w:bCs/>
+        </w:rPr>
+        <w:t>What’s actually happening:</w:t>
+      </w:r>
+    </w:p>
+    <w:p>
+      <w:r>
+        <w:t>[ EASY ] == [ Z2 ] ===================== [ HARD ]</w:t>
+      </w:r>
     </w:p>
     <w:p>
       <w:r>
@@ -3967,7 +3846,7 @@
     <w:p>
       <w:r>
         <w:pict w14:anchorId="28653075">
-          <v:rect id="_x0000_i1246" style="width:0;height:1.5pt" o:hralign="center" o:hrstd="t" o:hr="t" fillcolor="#a0a0a0" stroked="f"/>
+          <v:rect id="_x0000_i1052" style="width:0;height:1.5pt" o:hralign="center" o:hrstd="t" o:hr="t" fillcolor="#a0a0a0" stroked="f"/>
         </w:pict>
       </w:r>
     </w:p>
@@ -4048,15 +3927,7 @@
         <w:t>❌</w:t>
       </w:r>
       <w:r>
-        <w:t xml:space="preserve"> Too </w:t>
-      </w:r>
-      <w:proofErr w:type="gramStart"/>
-      <w:r>
-        <w:t>similar to</w:t>
-      </w:r>
-      <w:proofErr w:type="gramEnd"/>
-      <w:r>
-        <w:t xml:space="preserve"> tempo to create contrast</w:t>
+        <w:t xml:space="preserve"> Too similar to tempo to create contrast</w:t>
       </w:r>
     </w:p>
     <w:p>
@@ -4143,7 +4014,7 @@
     <w:p>
       <w:r>
         <w:pict w14:anchorId="4D00C634">
-          <v:rect id="_x0000_i1247" style="width:0;height:1.5pt" o:hralign="center" o:hrstd="t" o:hr="t" fillcolor="#a0a0a0" stroked="f"/>
+          <v:rect id="_x0000_i1053" style="width:0;height:1.5pt" o:hralign="center" o:hrstd="t" o:hr="t" fillcolor="#a0a0a0" stroked="f"/>
         </w:pict>
       </w:r>
     </w:p>
@@ -4220,22 +4091,10 @@
           <w:b/>
           <w:bCs/>
         </w:rPr>
-        <w:t xml:space="preserve">210–225 </w:t>
-      </w:r>
-      <w:proofErr w:type="spellStart"/>
-      <w:r>
-        <w:rPr>
-          <w:b/>
-          <w:bCs/>
-        </w:rPr>
-        <w:t>W</w:t>
-      </w:r>
-      <w:r>
-        <w:t xml:space="preserve"> as</w:t>
-      </w:r>
-      <w:proofErr w:type="spellEnd"/>
-      <w:r>
-        <w:t xml:space="preserve"> </w:t>
+        <w:t>210–225 W</w:t>
+      </w:r>
+      <w:r>
+        <w:t xml:space="preserve"> as </w:t>
       </w:r>
       <w:r>
         <w:rPr>
@@ -4275,22 +4134,10 @@
           <w:b/>
           <w:bCs/>
         </w:rPr>
-        <w:t xml:space="preserve">–15 to –25 </w:t>
-      </w:r>
-      <w:proofErr w:type="spellStart"/>
-      <w:r>
-        <w:rPr>
-          <w:b/>
-          <w:bCs/>
-        </w:rPr>
-        <w:t>W</w:t>
-      </w:r>
-      <w:r>
-        <w:t xml:space="preserve"> on</w:t>
-      </w:r>
-      <w:proofErr w:type="spellEnd"/>
-      <w:r>
-        <w:t xml:space="preserve"> easy days will:</w:t>
+        <w:t>–15 to –25 W</w:t>
+      </w:r>
+      <w:r>
+        <w:t xml:space="preserve"> on easy days will:</w:t>
       </w:r>
     </w:p>
     <w:p>
@@ -4340,7 +4187,7 @@
     <w:p>
       <w:r>
         <w:pict w14:anchorId="31C0A098">
-          <v:rect id="_x0000_i1248" style="width:0;height:1.5pt" o:hralign="center" o:hrstd="t" o:hr="t" fillcolor="#a0a0a0" stroked="f"/>
+          <v:rect id="_x0000_i1054" style="width:0;height:1.5pt" o:hralign="center" o:hrstd="t" o:hr="t" fillcolor="#a0a0a0" stroked="f"/>
         </w:pict>
       </w:r>
     </w:p>
@@ -4393,23 +4240,7 @@
           <w:b/>
           <w:bCs/>
         </w:rPr>
-        <w:t xml:space="preserve">% of your Z2 time that’s </w:t>
-      </w:r>
-      <w:proofErr w:type="gramStart"/>
-      <w:r>
-        <w:rPr>
-          <w:b/>
-          <w:bCs/>
-        </w:rPr>
-        <w:t>actually above</w:t>
-      </w:r>
-      <w:proofErr w:type="gramEnd"/>
-      <w:r>
-        <w:rPr>
-          <w:b/>
-          <w:bCs/>
-        </w:rPr>
-        <w:t xml:space="preserve"> LT1</w:t>
+        <w:t>% of your Z2 time that’s actually above LT1</w:t>
       </w:r>
       <w:r>
         <w:t>, or</w:t>
@@ -11340,6 +11171,7 @@
   <w:style w:type="character" w:default="1" w:styleId="DefaultParagraphFont">
     <w:name w:val="Default Paragraph Font"/>
     <w:uiPriority w:val="1"/>
+    <w:semiHidden/>
     <w:unhideWhenUsed/>
   </w:style>
   <w:style w:type="table" w:default="1" w:styleId="TableNormal">

</xml_diff>